<commit_message>
report docx: convert chapter3 UC tables to grid; add bordered reference doc; re-render all docx
</commit_message>
<xml_diff>
--- a/Project-info/reports/docx/Data-Dictionary-Report.docx
+++ b/Project-info/reports/docx/Data-Dictionary-Report.docx
@@ -48145,14 +48145,20 @@
   <w:style w:default="1" w:styleId="TableNormal" w:type="table">
     <w:name w:val="Normal Table"/>
     <w:uiPriority w:val="99"/>
-    <w:semiHidden/>
-    <w:unhideWhenUsed/>
     <w:tblPr>
       <w:tblInd w:type="dxa" w:w="0"/>
+      <w:tblBorders>
+        <w:top w:color="auto" w:space="0" w:sz="4" w:val="single"/>
+        <w:left w:color="auto" w:space="0" w:sz="4" w:val="single"/>
+        <w:bottom w:color="auto" w:space="0" w:sz="4" w:val="single"/>
+        <w:right w:color="auto" w:space="0" w:sz="4" w:val="single"/>
+        <w:insideH w:color="auto" w:space="0" w:sz="4" w:val="single"/>
+        <w:insideV w:color="auto" w:space="0" w:sz="4" w:val="single"/>
+      </w:tblBorders>
       <w:tblCellMar>
-        <w:top w:type="dxa" w:w="0"/>
+        <w:top w:type="dxa" w:w="60"/>
         <w:left w:type="dxa" w:w="108"/>
-        <w:bottom w:type="dxa" w:w="0"/>
+        <w:bottom w:type="dxa" w:w="60"/>
         <w:right w:type="dxa" w:w="108"/>
       </w:tblCellMar>
     </w:tblPr>

</xml_diff>